<commit_message>
Make deputes and ressources editable
</commit_message>
<xml_diff>
--- a/Guide-superviseur.docx
+++ b/Guide-superviseur.docx
@@ -23,28 +23,28 @@
         <w:t xml:space="preserve"> </w:t>
       </w:r>
       <w:r>
-        <w:t xml:space="preserve">Concertations, Tables de quartier, cartes).</w:t>
-      </w:r>
-      <w:r>
-        <w:t xml:space="preserve"> </w:t>
-      </w:r>
-      <w:r>
-        <w:rPr>
-          <w:b/>
-        </w:rPr>
-        <w:t xml:space="preserve">Vous n’avez jamais besoin de</w:t>
-      </w:r>
-      <w:r>
-        <w:rPr>
-          <w:b/>
-        </w:rPr>
-        <w:t xml:space="preserve"> </w:t>
-      </w:r>
-      <w:r>
-        <w:rPr>
-          <w:b/>
-        </w:rPr>
-        <w:t xml:space="preserve">toucher au code.</w:t>
+        <w:t xml:space="preserve">Concertations, Tables de quartier, Ressources, cartes).</w:t>
+      </w:r>
+      <w:r>
+        <w:t xml:space="preserve"> </w:t>
+      </w:r>
+      <w:r>
+        <w:rPr>
+          <w:b/>
+        </w:rPr>
+        <w:t xml:space="preserve">Vous n’avez jamais</w:t>
+      </w:r>
+      <w:r>
+        <w:rPr>
+          <w:b/>
+        </w:rPr>
+        <w:t xml:space="preserve"> </w:t>
+      </w:r>
+      <w:r>
+        <w:rPr>
+          <w:b/>
+        </w:rPr>
+        <w:t xml:space="preserve">besoin de toucher au code.</w:t>
       </w:r>
       <w:r>
         <w:t xml:space="preserve"> </w:t>
@@ -59,48 +59,42 @@
         <w:rPr>
           <w:b/>
         </w:rPr>
-        <w:t xml:space="preserve">trois feuilles Google</w:t>
+        <w:t xml:space="preserve">quatre</w:t>
+      </w:r>
+      <w:r>
+        <w:rPr>
+          <w:b/>
+        </w:rPr>
+        <w:t xml:space="preserve"> </w:t>
+      </w:r>
+      <w:r>
+        <w:rPr>
+          <w:b/>
+        </w:rPr>
+        <w:t xml:space="preserve">feuilles Google</w:t>
+      </w:r>
+      <w:r>
+        <w:t xml:space="preserve">. Vous y faites vos changements ; le site se met à jour</w:t>
+      </w:r>
+      <w:r>
+        <w:t xml:space="preserve"> </w:t>
+      </w:r>
+      <w:r>
+        <w:rPr>
+          <w:b/>
+        </w:rPr>
+        <w:t xml:space="preserve">automatiquement chaque nuit</w:t>
       </w:r>
       <w:r>
         <w:t xml:space="preserve">.</w:t>
       </w:r>
-      <w:r>
-        <w:t xml:space="preserve"> </w:t>
-      </w:r>
-      <w:r>
-        <w:t xml:space="preserve">Vous y faites vos changements ; le site se met à jour</w:t>
-      </w:r>
-      <w:r>
-        <w:t xml:space="preserve"> </w:t>
-      </w:r>
-      <w:r>
-        <w:rPr>
-          <w:b/>
-        </w:rPr>
-        <w:t xml:space="preserve">automatiquement chaque</w:t>
-      </w:r>
-      <w:r>
-        <w:rPr>
-          <w:b/>
-        </w:rPr>
-        <w:t xml:space="preserve"> </w:t>
-      </w:r>
-      <w:r>
-        <w:rPr>
-          <w:b/>
-        </w:rPr>
-        <w:t xml:space="preserve">nuit</w:t>
-      </w:r>
-      <w:r>
-        <w:t xml:space="preserve">.</w:t>
-      </w:r>
     </w:p>
     <w:p>
       <w:pPr>
         <w:pStyle w:val="BodyText"/>
       </w:pPr>
       <w:r>
-        <w:t xml:space="preserve">Les trois feuilles (partagées avec vous) :</w:t>
+        <w:t xml:space="preserve">Les quatre feuilles (partagées avec vous) :</w:t>
       </w:r>
     </w:p>
     <w:tbl>
@@ -225,7 +219,34 @@
               <w:jc w:val="left"/>
             </w:pPr>
             <w:r>
-              <w:t xml:space="preserve">Les partenaires, comités et définitions</w:t>
+              <w:t xml:space="preserve">Les partenaires et les comités</w:t>
+            </w:r>
+          </w:p>
+        </w:tc>
+      </w:tr>
+      <w:tr>
+        <w:tc>
+          <w:p>
+            <w:pPr>
+              <w:pStyle w:val="Compact"/>
+              <w:jc w:val="left"/>
+            </w:pPr>
+            <w:r>
+              <w:rPr>
+                <w:b/>
+              </w:rPr>
+              <w:t xml:space="preserve">Ressources — site</w:t>
+            </w:r>
+          </w:p>
+        </w:tc>
+        <w:tc>
+          <w:p>
+            <w:pPr>
+              <w:pStyle w:val="Compact"/>
+              <w:jc w:val="left"/>
+            </w:pPr>
+            <w:r>
+              <w:t xml:space="preserve">Le catalogue des sources documentaires</w:t>
             </w:r>
           </w:p>
         </w:tc>
@@ -328,13 +349,19 @@
         <w:t xml:space="preserve"> </w:t>
       </w:r>
       <w:r>
-        <w:t xml:space="preserve">✎ à côté de son titre (Glossaire, Concertations, panneau des Tables</w:t>
-      </w:r>
-      <w:r>
-        <w:t xml:space="preserve"> </w:t>
-      </w:r>
-      <w:r>
-        <w:t xml:space="preserve">de quartier). Cliquer le crayon ouvre directement la bonne feuille Google.</w:t>
+        <w:t xml:space="preserve">✎ à côté de son titre (Glossaire, Concertations, Ressources, panneau</w:t>
+      </w:r>
+      <w:r>
+        <w:t xml:space="preserve"> </w:t>
+      </w:r>
+      <w:r>
+        <w:t xml:space="preserve">des Tables de quartier). Cliquer le crayon ouvre directement la bonne feuille</w:t>
+      </w:r>
+      <w:r>
+        <w:t xml:space="preserve"> </w:t>
+      </w:r>
+      <w:r>
+        <w:t xml:space="preserve">Google.</w:t>
       </w:r>
       <w:r>
         <w:t xml:space="preserve"> </w:t>
@@ -1189,7 +1216,7 @@
         <w:rPr>
           <w:b/>
         </w:rPr>
-        <w:t xml:space="preserve">cinq onglets</w:t>
+        <w:t xml:space="preserve">trois onglets à modifier</w:t>
       </w:r>
       <w:r>
         <w:t xml:space="preserve"> </w:t>
@@ -1231,7 +1258,19 @@
         <w:t xml:space="preserve">Composition</w:t>
       </w:r>
       <w:r>
-        <w:t xml:space="preserve">,</w:t>
+        <w:t xml:space="preserve">.</w:t>
+      </w:r>
+      <w:r>
+        <w:t xml:space="preserve"> </w:t>
+      </w:r>
+      <w:r>
+        <w:t xml:space="preserve">Les familles (groupes) ne sont plus un onglet à part : elles se déduisent</w:t>
+      </w:r>
+      <w:r>
+        <w:t xml:space="preserve"> </w:t>
+      </w:r>
+      <w:r>
+        <w:t xml:space="preserve">automatiquement des colonnes</w:t>
       </w:r>
       <w:r>
         <w:t xml:space="preserve"> </w:t>
@@ -1240,10 +1279,13 @@
         <w:rPr>
           <w:rStyle w:val="VerbatimChar"/>
         </w:rPr>
-        <w:t xml:space="preserve">Definitions</w:t>
-      </w:r>
-      <w:r>
-        <w:t xml:space="preserve">,</w:t>
+        <w:t xml:space="preserve">famille</w:t>
+      </w:r>
+      <w:r>
+        <w:t xml:space="preserve"> </w:t>
+      </w:r>
+      <w:r>
+        <w:t xml:space="preserve">/</w:t>
       </w:r>
       <w:r>
         <w:t xml:space="preserve"> </w:t>
@@ -1252,43 +1294,66 @@
         <w:rPr>
           <w:rStyle w:val="VerbatimChar"/>
         </w:rPr>
-        <w:t xml:space="preserve">Postures</w:t>
-      </w:r>
-      <w:r>
-        <w:t xml:space="preserve">. Les familles (groupes) ne sont plus un onglet à</w:t>
-      </w:r>
-      <w:r>
-        <w:t xml:space="preserve"> </w:t>
-      </w:r>
-      <w:r>
-        <w:t xml:space="preserve">part : elles se déduisent automatiquement des colonnes</w:t>
-      </w:r>
-      <w:r>
-        <w:t xml:space="preserve"> </w:t>
-      </w:r>
-      <w:r>
-        <w:rPr>
-          <w:rStyle w:val="VerbatimChar"/>
-        </w:rPr>
-        <w:t xml:space="preserve">famille</w:t>
-      </w:r>
-      <w:r>
-        <w:t xml:space="preserve"> </w:t>
-      </w:r>
-      <w:r>
-        <w:t xml:space="preserve">/</w:t>
-      </w:r>
-      <w:r>
-        <w:t xml:space="preserve"> </w:t>
-      </w:r>
-      <w:r>
-        <w:rPr>
-          <w:rStyle w:val="VerbatimChar"/>
-        </w:rPr>
         <w:t xml:space="preserve">groupe</w:t>
       </w:r>
       <w:r>
         <w:t xml:space="preserve">.</w:t>
+      </w:r>
+    </w:p>
+    <w:p>
+      <w:pPr>
+        <w:pStyle w:val="BlockText"/>
+      </w:pPr>
+      <w:r>
+        <w:t xml:space="preserve">Le</w:t>
+      </w:r>
+      <w:r>
+        <w:t xml:space="preserve"> </w:t>
+      </w:r>
+      <w:r>
+        <w:rPr>
+          <w:b/>
+        </w:rPr>
+        <w:t xml:space="preserve">lexique</w:t>
+      </w:r>
+      <w:r>
+        <w:t xml:space="preserve"> </w:t>
+      </w:r>
+      <w:r>
+        <w:t xml:space="preserve">de bas de section et les</w:t>
+      </w:r>
+      <w:r>
+        <w:t xml:space="preserve"> </w:t>
+      </w:r>
+      <w:r>
+        <w:rPr>
+          <w:b/>
+        </w:rPr>
+        <w:t xml:space="preserve">cinq postures de la DRSP</w:t>
+      </w:r>
+      <w:r>
+        <w:t xml:space="preserve"> </w:t>
+      </w:r>
+      <w:r>
+        <w:t xml:space="preserve">restent</w:t>
+      </w:r>
+      <w:r>
+        <w:t xml:space="preserve"> </w:t>
+      </w:r>
+      <w:r>
+        <w:t xml:space="preserve">affichés sur le site, mais ne se modifient plus ici : leurs onglets ont été</w:t>
+      </w:r>
+      <w:r>
+        <w:t xml:space="preserve"> </w:t>
+      </w:r>
+      <w:r>
+        <w:t xml:space="preserve">masqués. Leur contenu est figé et repris tel quel à chaque synchronisation.</w:t>
+      </w:r>
+      <w:r>
+        <w:t xml:space="preserve"> </w:t>
+      </w:r>
+      <w:r>
+        <w:t xml:space="preserve">Pour le faire évoluer, passez par l’administrateur·rice du site.</w:t>
       </w:r>
     </w:p>
     <w:p>
@@ -2649,11 +2714,22 @@
     </w:p>
     <w:p>
       <w:pPr>
-        <w:pStyle w:val="Heading3"/>
-      </w:pPr>
-      <w:bookmarkStart w:id="27" w:name="X60d446a5c0a3bc6dd269cf364f5bd30a198896f"/>
-      <w:r>
-        <w:t xml:space="preserve">Onglet</w:t>
+        <w:pStyle w:val="BlockText"/>
+      </w:pPr>
+      <w:r>
+        <w:t xml:space="preserve">L’</w:t>
+      </w:r>
+      <w:r>
+        <w:rPr>
+          <w:b/>
+        </w:rPr>
+        <w:t xml:space="preserve">ordre des lignes</w:t>
+      </w:r>
+      <w:r>
+        <w:t xml:space="preserve"> </w:t>
+      </w:r>
+      <w:r>
+        <w:t xml:space="preserve">des onglets</w:t>
       </w:r>
       <w:r>
         <w:t xml:space="preserve"> </w:t>
@@ -2662,229 +2738,95 @@
         <w:rPr>
           <w:rStyle w:val="VerbatimChar"/>
         </w:rPr>
-        <w:t xml:space="preserve">Definitions</w:t>
-      </w:r>
-      <w:r>
-        <w:t xml:space="preserve"> </w:t>
-      </w:r>
-      <w:r>
-        <w:t xml:space="preserve">— le lexique de bas de section</w:t>
+        <w:t xml:space="preserve">Partenaires</w:t>
+      </w:r>
+      <w:r>
+        <w:t xml:space="preserve"> </w:t>
+      </w:r>
+      <w:r>
+        <w:t xml:space="preserve">et</w:t>
+      </w:r>
+      <w:r>
+        <w:t xml:space="preserve"> </w:t>
+      </w:r>
+      <w:r>
+        <w:rPr>
+          <w:rStyle w:val="VerbatimChar"/>
+        </w:rPr>
+        <w:t xml:space="preserve">Comites</w:t>
+      </w:r>
+      <w:r>
+        <w:t xml:space="preserve"> </w:t>
+      </w:r>
+      <w:r>
+        <w:t xml:space="preserve">fixe l’ordre</w:t>
+      </w:r>
+      <w:r>
+        <w:t xml:space="preserve"> </w:t>
+      </w:r>
+      <w:r>
+        <w:t xml:space="preserve">d’affichage ; les familles/groupes apparaissent dans l’ordre de leur première</w:t>
+      </w:r>
+      <w:r>
+        <w:t xml:space="preserve"> </w:t>
+      </w:r>
+      <w:r>
+        <w:t xml:space="preserve">occurrence.</w:t>
+      </w:r>
+    </w:p>
+    <w:p>
+      <w:r>
+        <w:pict>
+          <v:rect style="width:0;height:1.5pt" o:hralign="center" o:hrstd="t" o:hr="t"/>
+        </w:pict>
+      </w:r>
+    </w:p>
+    <w:p>
+      <w:pPr>
+        <w:pStyle w:val="Heading2"/>
+      </w:pPr>
+      <w:bookmarkStart w:id="27" w:name="Xa7a3204cbec9aa318fc45e01ff2f11d87390a58"/>
+      <w:r>
+        <w:t xml:space="preserve">4. Ressources — feuille « Ressources — site », onglet</w:t>
+      </w:r>
+      <w:r>
+        <w:t xml:space="preserve"> </w:t>
+      </w:r>
+      <w:r>
+        <w:rPr>
+          <w:rStyle w:val="VerbatimChar"/>
+        </w:rPr>
+        <w:t xml:space="preserve">Ressources</w:t>
       </w:r>
       <w:bookmarkEnd w:id="27"/>
     </w:p>
-    <w:tbl>
-      <w:tblPr>
-        <w:tblStyle w:val="Table"/>
-        <w:tblW w:type="pct" w:w="0.0"/>
-        <w:tblLook w:firstRow="1"/>
-      </w:tblPr>
-      <w:tblGrid/>
-      <w:tr>
-        <w:trPr>
-          <w:cnfStyle w:firstRow="1"/>
-        </w:trPr>
-        <w:tc>
-          <w:tcPr>
-            <w:tcBorders>
-              <w:bottom w:val="single"/>
-            </w:tcBorders>
-            <w:vAlign w:val="bottom"/>
-          </w:tcPr>
-          <w:p>
-            <w:pPr>
-              <w:pStyle w:val="Compact"/>
-              <w:jc w:val="left"/>
-            </w:pPr>
-            <w:r>
-              <w:t xml:space="preserve">Colonne</w:t>
-            </w:r>
-          </w:p>
-        </w:tc>
-        <w:tc>
-          <w:tcPr>
-            <w:tcBorders>
-              <w:bottom w:val="single"/>
-            </w:tcBorders>
-            <w:vAlign w:val="bottom"/>
-          </w:tcPr>
-          <w:p>
-            <w:pPr>
-              <w:pStyle w:val="Compact"/>
-              <w:jc w:val="left"/>
-            </w:pPr>
-            <w:r>
-              <w:t xml:space="preserve">À mettre</w:t>
-            </w:r>
-          </w:p>
-        </w:tc>
-      </w:tr>
-      <w:tr>
-        <w:tc>
-          <w:p>
-            <w:pPr>
-              <w:pStyle w:val="Compact"/>
-              <w:jc w:val="left"/>
-            </w:pPr>
-            <w:r>
-              <w:rPr>
-                <w:b/>
-              </w:rPr>
-              <w:t xml:space="preserve">terme</w:t>
-            </w:r>
-          </w:p>
-        </w:tc>
-        <w:tc>
-          <w:p>
-            <w:pPr>
-              <w:pStyle w:val="Compact"/>
-              <w:jc w:val="left"/>
-            </w:pPr>
-            <w:r>
-              <w:t xml:space="preserve">Le terme défini, ex.</w:t>
-            </w:r>
-            <w:r>
-              <w:t xml:space="preserve"> </w:t>
-            </w:r>
-            <w:r>
-              <w:rPr>
-                <w:rStyle w:val="VerbatimChar"/>
-              </w:rPr>
-              <w:t xml:space="preserve">Communauté de pratique</w:t>
-            </w:r>
-          </w:p>
-        </w:tc>
-      </w:tr>
-      <w:tr>
-        <w:tc>
-          <w:p>
-            <w:pPr>
-              <w:pStyle w:val="Compact"/>
-              <w:jc w:val="left"/>
-            </w:pPr>
-            <w:r>
-              <w:rPr>
-                <w:b/>
-              </w:rPr>
-              <w:t xml:space="preserve">acronym</w:t>
-            </w:r>
-          </w:p>
-        </w:tc>
-        <w:tc>
-          <w:p>
-            <w:pPr>
-              <w:pStyle w:val="Compact"/>
-              <w:jc w:val="left"/>
-            </w:pPr>
-            <w:r>
-              <w:t xml:space="preserve">Son sigle (facultatif), ex.</w:t>
-            </w:r>
-            <w:r>
-              <w:t xml:space="preserve"> </w:t>
-            </w:r>
-            <w:r>
-              <w:rPr>
-                <w:rStyle w:val="VerbatimChar"/>
-              </w:rPr>
-              <w:t xml:space="preserve">CoP</w:t>
-            </w:r>
-          </w:p>
-        </w:tc>
-      </w:tr>
-      <w:tr>
-        <w:tc>
-          <w:p>
-            <w:pPr>
-              <w:pStyle w:val="Compact"/>
-              <w:jc w:val="left"/>
-            </w:pPr>
-            <w:r>
-              <w:rPr>
-                <w:b/>
-              </w:rPr>
-              <w:t xml:space="preserve">definition</w:t>
-            </w:r>
-          </w:p>
-        </w:tc>
-        <w:tc>
-          <w:p>
-            <w:pPr>
-              <w:pStyle w:val="Compact"/>
-              <w:jc w:val="left"/>
-            </w:pPr>
-            <w:r>
-              <w:t xml:space="preserve">La définition (le HTML simple comme</w:t>
-            </w:r>
-            <w:r>
-              <w:t xml:space="preserve"> </w:t>
-            </w:r>
-            <w:r>
-              <w:rPr>
-                <w:rStyle w:val="VerbatimChar"/>
-              </w:rPr>
-              <w:t xml:space="preserve">&lt;em&gt;…&lt;/em&gt;</w:t>
-            </w:r>
-            <w:r>
-              <w:t xml:space="preserve"> </w:t>
-            </w:r>
-            <w:r>
-              <w:t xml:space="preserve">est permis)</w:t>
-            </w:r>
-          </w:p>
-        </w:tc>
-      </w:tr>
-    </w:tbl>
-    <w:p>
-      <w:pPr>
-        <w:pStyle w:val="Heading3"/>
-      </w:pPr>
-      <w:bookmarkStart w:id="28" w:name="Xa55e48ddc19c2e612df6ba56bcf3fea56e730a6"/>
-      <w:r>
-        <w:t xml:space="preserve">Onglet</w:t>
-      </w:r>
-      <w:r>
-        <w:t xml:space="preserve"> </w:t>
-      </w:r>
-      <w:r>
-        <w:rPr>
-          <w:rStyle w:val="VerbatimChar"/>
-        </w:rPr>
-        <w:t xml:space="preserve">Postures</w:t>
-      </w:r>
-      <w:r>
-        <w:t xml:space="preserve"> </w:t>
-      </w:r>
-      <w:r>
-        <w:t xml:space="preserve">— les cinq postures de la DRSP</w:t>
-      </w:r>
-      <w:bookmarkEnd w:id="28"/>
-    </w:p>
     <w:p>
       <w:pPr>
         <w:pStyle w:val="FirstParagraph"/>
       </w:pPr>
       <w:r>
-        <w:t xml:space="preserve">Une posture = une ligne. Cet onglet est</w:t>
-      </w:r>
-      <w:r>
-        <w:t xml:space="preserve"> </w:t>
-      </w:r>
-      <w:r>
-        <w:rPr>
-          <w:b/>
-        </w:rPr>
-        <w:t xml:space="preserve">facultatif</w:t>
-      </w:r>
-      <w:r>
-        <w:t xml:space="preserve"> </w:t>
-      </w:r>
-      <w:r>
-        <w:t xml:space="preserve">: s’il est absent ou</w:t>
-      </w:r>
-      <w:r>
-        <w:t xml:space="preserve"> </w:t>
-      </w:r>
-      <w:r>
-        <w:t xml:space="preserve">vide, la section n’apparaît simplement pas sur le site.</w:t>
+        <w:t xml:space="preserve">Une ligne =</w:t>
+      </w:r>
+      <w:r>
+        <w:t xml:space="preserve"> </w:t>
+      </w:r>
+      <w:r>
+        <w:rPr>
+          <w:b/>
+        </w:rPr>
+        <w:t xml:space="preserve">une source documentaire</w:t>
+      </w:r>
+      <w:r>
+        <w:t xml:space="preserve"> </w:t>
+      </w:r>
+      <w:r>
+        <w:t xml:space="preserve">affichée dans l’onglet Ressources du</w:t>
+      </w:r>
+      <w:r>
+        <w:t xml:space="preserve"> </w:t>
+      </w:r>
+      <w:r>
+        <w:t xml:space="preserve">site (une fiche cliquable qui ouvre le document).</w:t>
       </w:r>
     </w:p>
     <w:tbl>
@@ -2947,54 +2889,18 @@
               <w:rPr>
                 <w:b/>
               </w:rPr>
-              <w:t xml:space="preserve">ordre</w:t>
-            </w:r>
-          </w:p>
-        </w:tc>
-        <w:tc>
-          <w:p>
-            <w:pPr>
-              <w:pStyle w:val="Compact"/>
-              <w:jc w:val="left"/>
-            </w:pPr>
-            <w:r>
-              <w:t xml:space="preserve">Numéro d’affichage :</w:t>
-            </w:r>
-            <w:r>
-              <w:t xml:space="preserve"> </w:t>
-            </w:r>
-            <w:r>
-              <w:rPr>
-                <w:rStyle w:val="VerbatimChar"/>
-              </w:rPr>
-              <w:t xml:space="preserve">1</w:t>
-            </w:r>
-            <w:r>
-              <w:t xml:space="preserve">,</w:t>
-            </w:r>
-            <w:r>
-              <w:t xml:space="preserve"> </w:t>
-            </w:r>
-            <w:r>
-              <w:rPr>
-                <w:rStyle w:val="VerbatimChar"/>
-              </w:rPr>
-              <w:t xml:space="preserve">2</w:t>
-            </w:r>
-            <w:r>
-              <w:t xml:space="preserve">,</w:t>
-            </w:r>
-            <w:r>
-              <w:t xml:space="preserve"> </w:t>
-            </w:r>
-            <w:r>
-              <w:rPr>
-                <w:rStyle w:val="VerbatimChar"/>
-              </w:rPr>
-              <w:t xml:space="preserve">3</w:t>
-            </w:r>
-            <w:r>
-              <w:t xml:space="preserve">…</w:t>
+              <w:t xml:space="preserve">Titre</w:t>
+            </w:r>
+          </w:p>
+        </w:tc>
+        <w:tc>
+          <w:p>
+            <w:pPr>
+              <w:pStyle w:val="Compact"/>
+              <w:jc w:val="left"/>
+            </w:pPr>
+            <w:r>
+              <w:t xml:space="preserve">Le titre exact du document, tel qu’il doit s’afficher</w:t>
             </w:r>
           </w:p>
         </w:tc>
@@ -3010,18 +2916,18 @@
               <w:rPr>
                 <w:b/>
               </w:rPr>
-              <w:t xml:space="preserve">posture</w:t>
-            </w:r>
-          </w:p>
-        </w:tc>
-        <w:tc>
-          <w:p>
-            <w:pPr>
-              <w:pStyle w:val="Compact"/>
-              <w:jc w:val="left"/>
-            </w:pPr>
-            <w:r>
-              <w:t xml:space="preserve">Le nom de la posture, ex.</w:t>
+              <w:t xml:space="preserve">Organisme</w:t>
+            </w:r>
+          </w:p>
+        </w:tc>
+        <w:tc>
+          <w:p>
+            <w:pPr>
+              <w:pStyle w:val="Compact"/>
+              <w:jc w:val="left"/>
+            </w:pPr>
+            <w:r>
+              <w:t xml:space="preserve">L’auteur ou l’organisme éditeur, ex.</w:t>
             </w:r>
             <w:r>
               <w:t xml:space="preserve"> </w:t>
@@ -3030,7 +2936,7 @@
               <w:rPr>
                 <w:rStyle w:val="VerbatimChar"/>
               </w:rPr>
-              <w:t xml:space="preserve">Convocatrice</w:t>
+              <w:t xml:space="preserve">Organisation mondiale de la Santé (OMS)</w:t>
             </w:r>
           </w:p>
         </w:tc>
@@ -3046,18 +2952,36 @@
               <w:rPr>
                 <w:b/>
               </w:rPr>
-              <w:t xml:space="preserve">description</w:t>
-            </w:r>
-          </w:p>
-        </w:tc>
-        <w:tc>
-          <w:p>
-            <w:pPr>
-              <w:pStyle w:val="Compact"/>
-              <w:jc w:val="left"/>
-            </w:pPr>
-            <w:r>
-              <w:t xml:space="preserve">Une phrase décrivant la posture</w:t>
+              <w:t xml:space="preserve">Date</w:t>
+            </w:r>
+          </w:p>
+        </w:tc>
+        <w:tc>
+          <w:p>
+            <w:pPr>
+              <w:pStyle w:val="Compact"/>
+              <w:jc w:val="left"/>
+            </w:pPr>
+            <w:r>
+              <w:t xml:space="preserve">L’année (</w:t>
+            </w:r>
+            <w:r>
+              <w:rPr>
+                <w:rStyle w:val="VerbatimChar"/>
+              </w:rPr>
+              <w:t xml:space="preserve">2024</w:t>
+            </w:r>
+            <w:r>
+              <w:t xml:space="preserve">) ou l’année-mois (</w:t>
+            </w:r>
+            <w:r>
+              <w:rPr>
+                <w:rStyle w:val="VerbatimChar"/>
+              </w:rPr>
+              <w:t xml:space="preserve">2024-06</w:t>
+            </w:r>
+            <w:r>
+              <w:t xml:space="preserve">)</w:t>
             </w:r>
           </w:p>
         </w:tc>
@@ -3073,18 +2997,27 @@
               <w:rPr>
                 <w:b/>
               </w:rPr>
-              <w:t xml:space="preserve">exemple</w:t>
-            </w:r>
-          </w:p>
-        </w:tc>
-        <w:tc>
-          <w:p>
-            <w:pPr>
-              <w:pStyle w:val="Compact"/>
-              <w:jc w:val="left"/>
-            </w:pPr>
-            <w:r>
-              <w:t xml:space="preserve">Exemples concrets (le HTML simple comme</w:t>
+              <w:t xml:space="preserve">Etiquette</w:t>
+            </w:r>
+          </w:p>
+        </w:tc>
+        <w:tc>
+          <w:p>
+            <w:pPr>
+              <w:pStyle w:val="Compact"/>
+              <w:jc w:val="left"/>
+            </w:pPr>
+            <w:r>
+              <w:rPr>
+                <w:b/>
+              </w:rPr>
+              <w:t xml:space="preserve">Une seule</w:t>
+            </w:r>
+            <w:r>
+              <w:t xml:space="preserve"> </w:t>
+            </w:r>
+            <w:r>
+              <w:t xml:space="preserve">valeur parmi</w:t>
             </w:r>
             <w:r>
               <w:t xml:space="preserve"> </w:t>
@@ -3093,97 +3026,102 @@
               <w:rPr>
                 <w:rStyle w:val="VerbatimChar"/>
               </w:rPr>
-              <w:t xml:space="preserve">&lt;strong&gt;…&lt;/strong&gt;</w:t>
-            </w:r>
-            <w:r>
-              <w:t xml:space="preserve"> </w:t>
-            </w:r>
-            <w:r>
-              <w:t xml:space="preserve">est permis)</w:t>
+              <w:t xml:space="preserve">Contexte</w:t>
+            </w:r>
+            <w:r>
+              <w:t xml:space="preserve">,</w:t>
+            </w:r>
+            <w:r>
+              <w:t xml:space="preserve"> </w:t>
+            </w:r>
+            <w:r>
+              <w:rPr>
+                <w:rStyle w:val="VerbatimChar"/>
+              </w:rPr>
+              <w:t xml:space="preserve">DS</w:t>
+            </w:r>
+            <w:r>
+              <w:t xml:space="preserve">,</w:t>
+            </w:r>
+            <w:r>
+              <w:t xml:space="preserve"> </w:t>
+            </w:r>
+            <w:r>
+              <w:rPr>
+                <w:rStyle w:val="VerbatimChar"/>
+              </w:rPr>
+              <w:t xml:space="preserve">DC</w:t>
+            </w:r>
+            <w:r>
+              <w:t xml:space="preserve">,</w:t>
+            </w:r>
+            <w:r>
+              <w:t xml:space="preserve"> </w:t>
+            </w:r>
+            <w:r>
+              <w:rPr>
+                <w:rStyle w:val="VerbatimChar"/>
+              </w:rPr>
+              <w:t xml:space="preserve">Montréal</w:t>
+            </w:r>
+            <w:r>
+              <w:t xml:space="preserve">,</w:t>
+            </w:r>
+            <w:r>
+              <w:t xml:space="preserve"> </w:t>
+            </w:r>
+            <w:r>
+              <w:rPr>
+                <w:rStyle w:val="VerbatimChar"/>
+              </w:rPr>
+              <w:t xml:space="preserve">Outils</w:t>
+            </w:r>
+            <w:r>
+              <w:t xml:space="preserve"> </w:t>
+            </w:r>
+            <w:r>
+              <w:t xml:space="preserve">(liste déroulante)</w:t>
+            </w:r>
+          </w:p>
+        </w:tc>
+      </w:tr>
+      <w:tr>
+        <w:tc>
+          <w:p>
+            <w:pPr>
+              <w:pStyle w:val="Compact"/>
+              <w:jc w:val="left"/>
+            </w:pPr>
+            <w:r>
+              <w:rPr>
+                <w:b/>
+              </w:rPr>
+              <w:t xml:space="preserve">Lien</w:t>
+            </w:r>
+          </w:p>
+        </w:tc>
+        <w:tc>
+          <w:p>
+            <w:pPr>
+              <w:pStyle w:val="Compact"/>
+              <w:jc w:val="left"/>
+            </w:pPr>
+            <w:r>
+              <w:t xml:space="preserve">L’adresse complète du document, commençant par</w:t>
+            </w:r>
+            <w:r>
+              <w:t xml:space="preserve"> </w:t>
+            </w:r>
+            <w:r>
+              <w:rPr>
+                <w:rStyle w:val="VerbatimChar"/>
+              </w:rPr>
+              <w:t xml:space="preserve">https://</w:t>
             </w:r>
           </w:p>
         </w:tc>
       </w:tr>
     </w:tbl>
-    <w:p>
-      <w:pPr>
-        <w:pStyle w:val="BlockText"/>
-      </w:pPr>
-      <w:r>
-        <w:t xml:space="preserve">L’</w:t>
-      </w:r>
-      <w:r>
-        <w:rPr>
-          <w:b/>
-        </w:rPr>
-        <w:t xml:space="preserve">ordre des lignes</w:t>
-      </w:r>
-      <w:r>
-        <w:t xml:space="preserve"> </w:t>
-      </w:r>
-      <w:r>
-        <w:t xml:space="preserve">des onglets</w:t>
-      </w:r>
-      <w:r>
-        <w:t xml:space="preserve"> </w:t>
-      </w:r>
-      <w:r>
-        <w:rPr>
-          <w:rStyle w:val="VerbatimChar"/>
-        </w:rPr>
-        <w:t xml:space="preserve">Partenaires</w:t>
-      </w:r>
-      <w:r>
-        <w:t xml:space="preserve"> </w:t>
-      </w:r>
-      <w:r>
-        <w:t xml:space="preserve">et</w:t>
-      </w:r>
-      <w:r>
-        <w:t xml:space="preserve"> </w:t>
-      </w:r>
-      <w:r>
-        <w:rPr>
-          <w:rStyle w:val="VerbatimChar"/>
-        </w:rPr>
-        <w:t xml:space="preserve">Comites</w:t>
-      </w:r>
-      <w:r>
-        <w:t xml:space="preserve"> </w:t>
-      </w:r>
-      <w:r>
-        <w:t xml:space="preserve">fixe l’ordre</w:t>
-      </w:r>
-      <w:r>
-        <w:t xml:space="preserve"> </w:t>
-      </w:r>
-      <w:r>
-        <w:t xml:space="preserve">d’affichage ; les familles/groupes apparaissent dans l’ordre de leur première</w:t>
-      </w:r>
-      <w:r>
-        <w:t xml:space="preserve"> </w:t>
-      </w:r>
-      <w:r>
-        <w:t xml:space="preserve">occurrence.</w:t>
-      </w:r>
-    </w:p>
-    <w:p>
-      <w:r>
-        <w:pict>
-          <v:rect style="width:0;height:1.5pt" o:hralign="center" o:hrstd="t" o:hr="t"/>
-        </w:pict>
-      </w:r>
-    </w:p>
-    <w:p>
-      <w:pPr>
-        <w:pStyle w:val="Heading2"/>
-      </w:pPr>
-      <w:bookmarkStart w:id="29" w:name="conseils"/>
-      <w:r>
-        <w:t xml:space="preserve">Conseils</w:t>
-      </w:r>
-      <w:bookmarkEnd w:id="29"/>
-    </w:p>
     <w:p>
       <w:pPr>
         <w:numPr>
@@ -3196,19 +3134,13 @@
         <w:rPr>
           <w:b/>
         </w:rPr>
-        <w:t xml:space="preserve">Une modification, un test</w:t>
-      </w:r>
-      <w:r>
-        <w:t xml:space="preserve"> </w:t>
-      </w:r>
-      <w:r>
-        <w:t xml:space="preserve">: changez peu de choses à la fois, puis vérifiez</w:t>
-      </w:r>
-      <w:r>
-        <w:t xml:space="preserve"> </w:t>
-      </w:r>
-      <w:r>
-        <w:t xml:space="preserve">le site le lendemain. C’est plus facile de repérer une erreur.</w:t>
+        <w:t xml:space="preserve">Ajouter une source</w:t>
+      </w:r>
+      <w:r>
+        <w:t xml:space="preserve"> </w:t>
+      </w:r>
+      <w:r>
+        <w:t xml:space="preserve">: nouvelle ligne, remplissez les cinq colonnes.</w:t>
       </w:r>
     </w:p>
     <w:p>
@@ -3223,13 +3155,13 @@
         <w:rPr>
           <w:b/>
         </w:rPr>
-        <w:t xml:space="preserve">Copiez une ligne existante</w:t>
-      </w:r>
-      <w:r>
-        <w:t xml:space="preserve"> </w:t>
-      </w:r>
-      <w:r>
-        <w:t xml:space="preserve">comme modèle plutôt que de partir de zéro.</w:t>
+        <w:t xml:space="preserve">Retirer une source</w:t>
+      </w:r>
+      <w:r>
+        <w:t xml:space="preserve"> </w:t>
+      </w:r>
+      <w:r>
+        <w:t xml:space="preserve">: supprimez la ligne entière.</w:t>
       </w:r>
     </w:p>
     <w:p>
@@ -3241,70 +3173,25 @@
         <w:pStyle w:val="Compact"/>
       </w:pPr>
       <w:r>
-        <w:t xml:space="preserve">Si vous</w:t>
-      </w:r>
-      <w:r>
-        <w:t xml:space="preserve"> </w:t>
-      </w:r>
-      <w:r>
-        <w:rPr>
-          <w:b/>
-        </w:rPr>
-        <w:t xml:space="preserve">renommez l’acronym</w:t>
-      </w:r>
-      <w:r>
-        <w:t xml:space="preserve"> </w:t>
-      </w:r>
-      <w:r>
-        <w:t xml:space="preserve">d’un comité ou d’un partenaire, pensez à le</w:t>
-      </w:r>
-      <w:r>
-        <w:t xml:space="preserve"> </w:t>
-      </w:r>
-      <w:r>
-        <w:t xml:space="preserve">mettre à jour aussi dans l’onglet</w:t>
-      </w:r>
-      <w:r>
-        <w:t xml:space="preserve"> </w:t>
-      </w:r>
-      <w:r>
-        <w:rPr>
-          <w:rStyle w:val="VerbatimChar"/>
-        </w:rPr>
-        <w:t xml:space="preserve">Composition</w:t>
-      </w:r>
-      <w:r>
-        <w:t xml:space="preserve"> </w:t>
-      </w:r>
-      <w:r>
-        <w:t xml:space="preserve">(colonnes</w:t>
-      </w:r>
-      <w:r>
-        <w:t xml:space="preserve"> </w:t>
-      </w:r>
-      <w:r>
-        <w:rPr>
-          <w:rStyle w:val="VerbatimChar"/>
-        </w:rPr>
-        <w:t xml:space="preserve">comite</w:t>
-      </w:r>
-      <w:r>
-        <w:t xml:space="preserve"> </w:t>
-      </w:r>
-      <w:r>
-        <w:t xml:space="preserve">et</w:t>
-      </w:r>
-      <w:r>
-        <w:t xml:space="preserve"> </w:t>
-      </w:r>
-      <w:r>
-        <w:rPr>
-          <w:rStyle w:val="VerbatimChar"/>
-        </w:rPr>
-        <w:t xml:space="preserve">partenaire</w:t>
-      </w:r>
-      <w:r>
-        <w:t xml:space="preserve">) : c’est lui qui fait le lien.</w:t>
+        <w:t xml:space="preserve">L’</w:t>
+      </w:r>
+      <w:r>
+        <w:rPr>
+          <w:b/>
+        </w:rPr>
+        <w:t xml:space="preserve">ordre des lignes n’a pas d’importance</w:t>
+      </w:r>
+      <w:r>
+        <w:t xml:space="preserve"> </w:t>
+      </w:r>
+      <w:r>
+        <w:t xml:space="preserve">: le site trie lui-même (plus</w:t>
+      </w:r>
+      <w:r>
+        <w:t xml:space="preserve"> </w:t>
+      </w:r>
+      <w:r>
+        <w:t xml:space="preserve">récentes par défaut, avec un choix de tri à l’écran).</w:t>
       </w:r>
     </w:p>
     <w:p>
@@ -3316,19 +3203,28 @@
         <w:pStyle w:val="Compact"/>
       </w:pPr>
       <w:r>
-        <w:t xml:space="preserve">Les listes dans une cellule se séparent par un point-virgule</w:t>
-      </w:r>
-      <w:r>
-        <w:t xml:space="preserve"> </w:t>
-      </w:r>
-      <w:r>
-        <w:rPr>
-          <w:rStyle w:val="VerbatimChar"/>
-        </w:rPr>
-        <w:t xml:space="preserve">;</w:t>
-      </w:r>
-      <w:r>
-        <w:t xml:space="preserve">.</w:t>
+        <w:t xml:space="preserve">La</w:t>
+      </w:r>
+      <w:r>
+        <w:t xml:space="preserve"> </w:t>
+      </w:r>
+      <w:r>
+        <w:rPr>
+          <w:b/>
+        </w:rPr>
+        <w:t xml:space="preserve">Date</w:t>
+      </w:r>
+      <w:r>
+        <w:t xml:space="preserve"> </w:t>
+      </w:r>
+      <w:r>
+        <w:t xml:space="preserve">ne sert qu’au tri et à l’affichage de l’année. Si vous ne</w:t>
+      </w:r>
+      <w:r>
+        <w:t xml:space="preserve"> </w:t>
+      </w:r>
+      <w:r>
+        <w:t xml:space="preserve">connaissez que l’année, mettez juste l’année.</w:t>
       </w:r>
     </w:p>
     <w:p>
@@ -3340,7 +3236,45 @@
         <w:pStyle w:val="Compact"/>
       </w:pPr>
       <w:r>
-        <w:t xml:space="preserve">Les cases à cocher se notent</w:t>
+        <w:t xml:space="preserve">Une ligne</w:t>
+      </w:r>
+      <w:r>
+        <w:t xml:space="preserve"> </w:t>
+      </w:r>
+      <w:r>
+        <w:rPr>
+          <w:b/>
+        </w:rPr>
+        <w:t xml:space="preserve">sans titre ou sans lien est ignorée</w:t>
+      </w:r>
+      <w:r>
+        <w:t xml:space="preserve"> </w:t>
+      </w:r>
+      <w:r>
+        <w:t xml:space="preserve">(et signalée dans le journal</w:t>
+      </w:r>
+      <w:r>
+        <w:t xml:space="preserve"> </w:t>
+      </w:r>
+      <w:r>
+        <w:t xml:space="preserve">de synchronisation) ; le reste du catalogue n’est pas affecté.</w:t>
+      </w:r>
+    </w:p>
+    <w:p>
+      <w:pPr>
+        <w:pStyle w:val="BlockText"/>
+      </w:pPr>
+      <w:r>
+        <w:rPr>
+          <w:b/>
+        </w:rPr>
+        <w:t xml:space="preserve">Les cinq étiquettes</w:t>
+      </w:r>
+      <w:r>
+        <w:t xml:space="preserve"> </w:t>
+      </w:r>
+      <w:r>
+        <w:t xml:space="preserve">:</w:t>
       </w:r>
       <w:r>
         <w:t xml:space="preserve"> </w:t>
@@ -3349,20 +3283,324 @@
         <w:rPr>
           <w:rStyle w:val="VerbatimChar"/>
         </w:rPr>
-        <w:t xml:space="preserve">x</w:t>
-      </w:r>
-      <w:r>
-        <w:t xml:space="preserve"> </w:t>
-      </w:r>
-      <w:r>
-        <w:t xml:space="preserve">(ou rien).</w:t>
-      </w:r>
+        <w:t xml:space="preserve">Contexte</w:t>
+      </w:r>
+      <w:r>
+        <w:t xml:space="preserve"> </w:t>
+      </w:r>
+      <w:r>
+        <w:t xml:space="preserve">= politiques, plans et cadres</w:t>
+      </w:r>
+      <w:r>
+        <w:t xml:space="preserve"> </w:t>
+      </w:r>
+      <w:r>
+        <w:t xml:space="preserve">structurants ·</w:t>
+      </w:r>
+      <w:r>
+        <w:t xml:space="preserve"> </w:t>
+      </w:r>
+      <w:r>
+        <w:rPr>
+          <w:rStyle w:val="VerbatimChar"/>
+        </w:rPr>
+        <w:t xml:space="preserve">DS</w:t>
+      </w:r>
+      <w:r>
+        <w:t xml:space="preserve"> </w:t>
+      </w:r>
+      <w:r>
+        <w:t xml:space="preserve">= développement social et déterminants sociaux de la santé</w:t>
+      </w:r>
+      <w:r>
+        <w:t xml:space="preserve"> </w:t>
+      </w:r>
+      <w:r>
+        <w:t xml:space="preserve">·</w:t>
+      </w:r>
+      <w:r>
+        <w:t xml:space="preserve"> </w:t>
+      </w:r>
+      <w:r>
+        <w:rPr>
+          <w:rStyle w:val="VerbatimChar"/>
+        </w:rPr>
+        <w:t xml:space="preserve">DC</w:t>
+      </w:r>
+      <w:r>
+        <w:t xml:space="preserve"> </w:t>
+      </w:r>
+      <w:r>
+        <w:t xml:space="preserve">= développement des communautés ·</w:t>
+      </w:r>
+      <w:r>
+        <w:t xml:space="preserve"> </w:t>
+      </w:r>
+      <w:r>
+        <w:rPr>
+          <w:rStyle w:val="VerbatimChar"/>
+        </w:rPr>
+        <w:t xml:space="preserve">Montréal</w:t>
+      </w:r>
+      <w:r>
+        <w:t xml:space="preserve"> </w:t>
+      </w:r>
+      <w:r>
+        <w:t xml:space="preserve">= démarches et exemples de</w:t>
+      </w:r>
+      <w:r>
+        <w:t xml:space="preserve"> </w:t>
+      </w:r>
+      <w:r>
+        <w:t xml:space="preserve">terrain montréalais ·</w:t>
+      </w:r>
+      <w:r>
+        <w:t xml:space="preserve"> </w:t>
+      </w:r>
+      <w:r>
+        <w:rPr>
+          <w:rStyle w:val="VerbatimChar"/>
+        </w:rPr>
+        <w:t xml:space="preserve">Outils</w:t>
+      </w:r>
+      <w:r>
+        <w:t xml:space="preserve"> </w:t>
+      </w:r>
+      <w:r>
+        <w:t xml:space="preserve">= outils pratiques et interactifs.</w:t>
+      </w:r>
+    </w:p>
+    <w:p>
+      <w:pPr>
+        <w:pStyle w:val="BlockText"/>
+      </w:pPr>
+      <w:r>
+        <w:rPr>
+          <w:b/>
+        </w:rPr>
+        <w:t xml:space="preserve">Les pages couverture ne sont pas dans cette feuille.</w:t>
+      </w:r>
+      <w:r>
+        <w:t xml:space="preserve"> </w:t>
+      </w:r>
+      <w:r>
+        <w:t xml:space="preserve">Aujourd’hui toutes</w:t>
+      </w:r>
+      <w:r>
+        <w:t xml:space="preserve"> </w:t>
+      </w:r>
+      <w:r>
+        <w:t xml:space="preserve">les fiches affichent un aperçu générique. Pour ajouter une vraie page</w:t>
+      </w:r>
+      <w:r>
+        <w:t xml:space="preserve"> </w:t>
+      </w:r>
+      <w:r>
+        <w:t xml:space="preserve">couverture, il faut déposer une image dans le dépôt : demandez à</w:t>
+      </w:r>
+      <w:r>
+        <w:t xml:space="preserve"> </w:t>
+      </w:r>
+      <w:r>
+        <w:t xml:space="preserve">l’administrateur·rice. Vous n’avez rien à saisir dans la feuille pour ça.</w:t>
+      </w:r>
+    </w:p>
+    <w:p>
+      <w:r>
+        <w:pict>
+          <v:rect style="width:0;height:1.5pt" o:hralign="center" o:hrstd="t" o:hr="t"/>
+        </w:pict>
+      </w:r>
+    </w:p>
+    <w:p>
+      <w:pPr>
+        <w:pStyle w:val="Heading2"/>
+      </w:pPr>
+      <w:bookmarkStart w:id="28" w:name="conseils"/>
+      <w:r>
+        <w:t xml:space="preserve">Conseils</w:t>
+      </w:r>
+      <w:bookmarkEnd w:id="28"/>
     </w:p>
     <w:p>
       <w:pPr>
         <w:numPr>
           <w:ilvl w:val="0"/>
-          <w:numId w:val="1003"/>
+          <w:numId w:val="1004"/>
+        </w:numPr>
+        <w:pStyle w:val="Compact"/>
+      </w:pPr>
+      <w:r>
+        <w:rPr>
+          <w:b/>
+        </w:rPr>
+        <w:t xml:space="preserve">Une modification, un test</w:t>
+      </w:r>
+      <w:r>
+        <w:t xml:space="preserve"> </w:t>
+      </w:r>
+      <w:r>
+        <w:t xml:space="preserve">: changez peu de choses à la fois, puis vérifiez</w:t>
+      </w:r>
+      <w:r>
+        <w:t xml:space="preserve"> </w:t>
+      </w:r>
+      <w:r>
+        <w:t xml:space="preserve">le site le lendemain. C’est plus facile de repérer une erreur.</w:t>
+      </w:r>
+    </w:p>
+    <w:p>
+      <w:pPr>
+        <w:numPr>
+          <w:ilvl w:val="0"/>
+          <w:numId w:val="1004"/>
+        </w:numPr>
+        <w:pStyle w:val="Compact"/>
+      </w:pPr>
+      <w:r>
+        <w:rPr>
+          <w:b/>
+        </w:rPr>
+        <w:t xml:space="preserve">Copiez une ligne existante</w:t>
+      </w:r>
+      <w:r>
+        <w:t xml:space="preserve"> </w:t>
+      </w:r>
+      <w:r>
+        <w:t xml:space="preserve">comme modèle plutôt que de partir de zéro.</w:t>
+      </w:r>
+    </w:p>
+    <w:p>
+      <w:pPr>
+        <w:numPr>
+          <w:ilvl w:val="0"/>
+          <w:numId w:val="1004"/>
+        </w:numPr>
+        <w:pStyle w:val="Compact"/>
+      </w:pPr>
+      <w:r>
+        <w:t xml:space="preserve">Si vous</w:t>
+      </w:r>
+      <w:r>
+        <w:t xml:space="preserve"> </w:t>
+      </w:r>
+      <w:r>
+        <w:rPr>
+          <w:b/>
+        </w:rPr>
+        <w:t xml:space="preserve">renommez l’acronym</w:t>
+      </w:r>
+      <w:r>
+        <w:t xml:space="preserve"> </w:t>
+      </w:r>
+      <w:r>
+        <w:t xml:space="preserve">d’un comité ou d’un partenaire, pensez à le</w:t>
+      </w:r>
+      <w:r>
+        <w:t xml:space="preserve"> </w:t>
+      </w:r>
+      <w:r>
+        <w:t xml:space="preserve">mettre à jour aussi dans l’onglet</w:t>
+      </w:r>
+      <w:r>
+        <w:t xml:space="preserve"> </w:t>
+      </w:r>
+      <w:r>
+        <w:rPr>
+          <w:rStyle w:val="VerbatimChar"/>
+        </w:rPr>
+        <w:t xml:space="preserve">Composition</w:t>
+      </w:r>
+      <w:r>
+        <w:t xml:space="preserve"> </w:t>
+      </w:r>
+      <w:r>
+        <w:t xml:space="preserve">(colonnes</w:t>
+      </w:r>
+      <w:r>
+        <w:t xml:space="preserve"> </w:t>
+      </w:r>
+      <w:r>
+        <w:rPr>
+          <w:rStyle w:val="VerbatimChar"/>
+        </w:rPr>
+        <w:t xml:space="preserve">comite</w:t>
+      </w:r>
+      <w:r>
+        <w:t xml:space="preserve"> </w:t>
+      </w:r>
+      <w:r>
+        <w:t xml:space="preserve">et</w:t>
+      </w:r>
+      <w:r>
+        <w:t xml:space="preserve"> </w:t>
+      </w:r>
+      <w:r>
+        <w:rPr>
+          <w:rStyle w:val="VerbatimChar"/>
+        </w:rPr>
+        <w:t xml:space="preserve">partenaire</w:t>
+      </w:r>
+      <w:r>
+        <w:t xml:space="preserve">) : c’est lui qui fait le lien.</w:t>
+      </w:r>
+    </w:p>
+    <w:p>
+      <w:pPr>
+        <w:numPr>
+          <w:ilvl w:val="0"/>
+          <w:numId w:val="1004"/>
+        </w:numPr>
+        <w:pStyle w:val="Compact"/>
+      </w:pPr>
+      <w:r>
+        <w:t xml:space="preserve">Les listes dans une cellule se séparent par un point-virgule</w:t>
+      </w:r>
+      <w:r>
+        <w:t xml:space="preserve"> </w:t>
+      </w:r>
+      <w:r>
+        <w:rPr>
+          <w:rStyle w:val="VerbatimChar"/>
+        </w:rPr>
+        <w:t xml:space="preserve">;</w:t>
+      </w:r>
+      <w:r>
+        <w:t xml:space="preserve">.</w:t>
+      </w:r>
+    </w:p>
+    <w:p>
+      <w:pPr>
+        <w:numPr>
+          <w:ilvl w:val="0"/>
+          <w:numId w:val="1004"/>
+        </w:numPr>
+        <w:pStyle w:val="Compact"/>
+      </w:pPr>
+      <w:r>
+        <w:t xml:space="preserve">Les cases à cocher se notent</w:t>
+      </w:r>
+      <w:r>
+        <w:t xml:space="preserve"> </w:t>
+      </w:r>
+      <w:r>
+        <w:rPr>
+          <w:rStyle w:val="VerbatimChar"/>
+        </w:rPr>
+        <w:t xml:space="preserve">x</w:t>
+      </w:r>
+      <w:r>
+        <w:t xml:space="preserve"> </w:t>
+      </w:r>
+      <w:r>
+        <w:t xml:space="preserve">(ou rien).</w:t>
+      </w:r>
+    </w:p>
+    <w:p>
+      <w:pPr>
+        <w:numPr>
+          <w:ilvl w:val="0"/>
+          <w:numId w:val="1004"/>
         </w:numPr>
         <w:pStyle w:val="Compact"/>
       </w:pPr>
@@ -3622,6 +3860,9 @@
     <w:abstractNumId w:val="991"/>
   </w:num>
   <w:num w:numId="1003">
+    <w:abstractNumId w:val="991"/>
+  </w:num>
+  <w:num w:numId="1004">
     <w:abstractNumId w:val="991"/>
   </w:num>
 </w:numbering>

</xml_diff>